<commit_message>
Feat: StudyBuddy now links to its website instead of its repo
</commit_message>
<xml_diff>
--- a/files/Prachponleu Uch's Resume.docx
+++ b/files/Prachponleu Uch's Resume.docx
@@ -1383,7 +1383,7 @@
             <w:color w:val="1155CC"/>
             <w:u w:val="single"/>
           </w:rPr>
-          <w:t>STUDYBU</w:t>
+          <w:t>STUD</w:t>
         </w:r>
         <w:r>
           <w:rPr>
@@ -1392,7 +1392,7 @@
             <w:color w:val="1155CC"/>
             <w:u w:val="single"/>
           </w:rPr>
-          <w:t>D</w:t>
+          <w:t>Y</w:t>
         </w:r>
         <w:r>
           <w:rPr>
@@ -1401,7 +1401,7 @@
             <w:color w:val="1155CC"/>
             <w:u w:val="single"/>
           </w:rPr>
-          <w:t>DY</w:t>
+          <w:t>BUDDY</w:t>
         </w:r>
       </w:hyperlink>
       <w:r>

</xml_diff>

<commit_message>
Add new URL for StudyBuddy
</commit_message>
<xml_diff>
--- a/files/Prachponleu Uch's Resume.docx
+++ b/files/Prachponleu Uch's Resume.docx
@@ -1383,7 +1383,7 @@
             <w:color w:val="1155CC"/>
             <w:u w:val="single"/>
           </w:rPr>
-          <w:t>STUD</w:t>
+          <w:t>ST</w:t>
         </w:r>
         <w:r>
           <w:rPr>
@@ -1392,7 +1392,7 @@
             <w:color w:val="1155CC"/>
             <w:u w:val="single"/>
           </w:rPr>
-          <w:t>Y</w:t>
+          <w:t>U</w:t>
         </w:r>
         <w:r>
           <w:rPr>
@@ -1401,7 +1401,7 @@
             <w:color w:val="1155CC"/>
             <w:u w:val="single"/>
           </w:rPr>
-          <w:t>BUDDY</w:t>
+          <w:t>DYBUDDY</w:t>
         </w:r>
       </w:hyperlink>
       <w:r>

</xml_diff>